<commit_message>
Phase 1: Update initial subnetting file
</commit_message>
<xml_diff>
--- a/Phase 1/Subnetting.docx
+++ b/Phase 1/Subnetting.docx
@@ -1,6 +1,6 @@
 
 <file path=word/document.xml><?xml version="1.0" encoding="utf-8"?>
-<w:document xmlns:wpc="http://schemas.microsoft.com/office/word/2010/wordprocessingCanvas" xmlns:cx="http://schemas.microsoft.com/office/drawing/2014/chartex" xmlns:cx1="http://schemas.microsoft.com/office/drawing/2015/9/8/chartex" xmlns:cx2="http://schemas.microsoft.com/office/drawing/2015/10/21/chartex" xmlns:cx3="http://schemas.microsoft.com/office/drawing/2016/5/9/chartex" xmlns:cx4="http://schemas.microsoft.com/office/drawing/2016/5/10/chartex" xmlns:cx5="http://schemas.microsoft.com/office/drawing/2016/5/11/chartex" xmlns:cx6="http://schemas.microsoft.com/office/drawing/2016/5/12/chartex" xmlns:cx7="http://schemas.microsoft.com/office/drawing/2016/5/13/chartex" xmlns:cx8="http://schemas.microsoft.com/office/drawing/2016/5/14/chartex" xmlns:mc="http://schemas.openxmlformats.org/markup-compatibility/2006" xmlns:aink="http://schemas.microsoft.com/office/drawing/2016/ink" xmlns:am3d="http://schemas.microsoft.com/office/drawing/2017/model3d" xmlns:o="urn:schemas-microsoft-com:office:office" xmlns:oel="http://schemas.microsoft.com/office/2019/extlst" xmlns:r="http://schemas.openxmlformats.org/officeDocument/2006/relationships" xmlns:m="http://schemas.openxmlformats.org/officeDocument/2006/math" xmlns:v="urn:schemas-microsoft-com:vml" xmlns:wp14="http://schemas.microsoft.com/office/word/2010/wordprocessingDrawing" xmlns:wp="http://schemas.openxmlformats.org/drawingml/2006/wordprocessingDrawing" xmlns:w10="urn:schemas-microsoft-com:office:word" xmlns:w="http://schemas.openxmlformats.org/wordprocessingml/2006/main" xmlns:w14="http://schemas.microsoft.com/office/word/2010/wordml" xmlns:w15="http://schemas.microsoft.com/office/word/2012/wordml" xmlns:w16cex="http://schemas.microsoft.com/office/word/2018/wordml/cex" xmlns:w16cid="http://schemas.microsoft.com/office/word/2016/wordml/cid" xmlns:w16="http://schemas.microsoft.com/office/word/2018/wordml" xmlns:w16du="http://schemas.microsoft.com/office/word/2023/wordml/word16du" xmlns:w16sdtdh="http://schemas.microsoft.com/office/word/2020/wordml/sdtdatahash" xmlns:w16sdtfl="http://schemas.microsoft.com/office/word/2024/wordml/sdtformatlock" xmlns:w16se="http://schemas.microsoft.com/office/word/2015/wordml/symex" xmlns:wpg="http://schemas.microsoft.com/office/word/2010/wordprocessingGroup" xmlns:wpi="http://schemas.microsoft.com/office/word/2010/wordprocessingInk" xmlns:wne="http://schemas.microsoft.com/office/word/2006/wordml" xmlns:wps="http://schemas.microsoft.com/office/word/2010/wordprocessingShape" mc:Ignorable="w14 w15 w16se w16cid w16 w16cex w16sdtdh w16sdtfl w16du wp14">
+<w:document xmlns:wpc="http://schemas.microsoft.com/office/word/2010/wordprocessingCanvas" xmlns:cx="http://schemas.microsoft.com/office/drawing/2014/chartex" xmlns:cx1="http://schemas.microsoft.com/office/drawing/2015/9/8/chartex" xmlns:cx2="http://schemas.microsoft.com/office/drawing/2015/10/21/chartex" xmlns:cx3="http://schemas.microsoft.com/office/drawing/2016/5/9/chartex" xmlns:cx4="http://schemas.microsoft.com/office/drawing/2016/5/10/chartex" xmlns:cx5="http://schemas.microsoft.com/office/drawing/2016/5/11/chartex" xmlns:cx6="http://schemas.microsoft.com/office/drawing/2016/5/12/chartex" xmlns:cx7="http://schemas.microsoft.com/office/drawing/2016/5/13/chartex" xmlns:cx8="http://schemas.microsoft.com/office/drawing/2016/5/14/chartex" xmlns:mc="http://schemas.openxmlformats.org/markup-compatibility/2006" xmlns:aink="http://schemas.microsoft.com/office/drawing/2016/ink" xmlns:am3d="http://schemas.microsoft.com/office/drawing/2017/model3d" xmlns:o="urn:schemas-microsoft-com:office:office" xmlns:oel="http://schemas.microsoft.com/office/2019/extlst" xmlns:r="http://schemas.openxmlformats.org/officeDocument/2006/relationships" xmlns:m="http://schemas.openxmlformats.org/officeDocument/2006/math" xmlns:v="urn:schemas-microsoft-com:vml" xmlns:wp14="http://schemas.microsoft.com/office/word/2010/wordprocessingDrawing" xmlns:wp="http://schemas.openxmlformats.org/drawingml/2006/wordprocessingDrawing" xmlns:w10="urn:schemas-microsoft-com:office:word" xmlns:w="http://schemas.openxmlformats.org/wordprocessingml/2006/main" xmlns:w14="http://schemas.microsoft.com/office/word/2010/wordml" xmlns:w15="http://schemas.microsoft.com/office/word/2012/wordml" xmlns:w16cei="http://schemas.microsoft.com/office/word/2026/wordml/cei" xmlns:w16cex="http://schemas.microsoft.com/office/word/2018/wordml/cex" xmlns:w16cid="http://schemas.microsoft.com/office/word/2016/wordml/cid" xmlns:w16="http://schemas.microsoft.com/office/word/2018/wordml" xmlns:w16du="http://schemas.microsoft.com/office/word/2023/wordml/word16du" xmlns:w16sdtdh="http://schemas.microsoft.com/office/word/2020/wordml/sdtdatahash" xmlns:w16sdtfl="http://schemas.microsoft.com/office/word/2024/wordml/sdtformatlock" xmlns:w16se="http://schemas.microsoft.com/office/word/2015/wordml/symex" xmlns:wpg="http://schemas.microsoft.com/office/word/2010/wordprocessingGroup" xmlns:wpi="http://schemas.microsoft.com/office/word/2010/wordprocessingInk" xmlns:wne="http://schemas.microsoft.com/office/word/2006/wordml" xmlns:wps="http://schemas.microsoft.com/office/word/2010/wordprocessingShape" mc:Ignorable="w14 w15 w16se w16cid w16 w16cex w16sdtdh w16sdtfl w16du wp14">
   <w:body>
     <w:p>
       <w:pPr>
@@ -40,6 +40,9 @@
       <w:r>
         <w:t>0.0/16</w:t>
       </w:r>
+      <w:r>
+        <w:t xml:space="preserve"> = 255.255.0.0 </w:t>
+      </w:r>
     </w:p>
     <w:p>
       <w:pPr>
@@ -50,8 +53,159 @@
         </w:numPr>
       </w:pPr>
       <w:r>
+        <w:t>In Binary: 11111111.</w:t>
+      </w:r>
+      <w:r>
+        <w:t xml:space="preserve"> </w:t>
+      </w:r>
+      <w:r>
+        <w:t>11111111.</w:t>
+      </w:r>
+      <w:r>
+        <w:t>00000000.</w:t>
+      </w:r>
+      <w:r>
+        <w:t xml:space="preserve"> </w:t>
+      </w:r>
+      <w:r>
+        <w:t>00000000</w:t>
+      </w:r>
+    </w:p>
+    <w:p>
+      <w:pPr>
+        <w:pStyle w:val="ListParagraph"/>
+        <w:numPr>
+          <w:ilvl w:val="0"/>
+          <w:numId w:val="1"/>
+        </w:numPr>
+      </w:pPr>
+      <w:r>
         <w:t>8 – 10 departments are expected (8 – 10 subnets)</w:t>
       </w:r>
+    </w:p>
+    <w:p/>
+    <w:p>
+      <w:r>
+        <w:t xml:space="preserve">I want to start by creating 2 subnets of &gt;=30000 usable IP hosts. One subnet will be for students and the other one I will use </w:t>
+      </w:r>
+      <w:r>
+        <w:t>Variable Length Subnet Masking</w:t>
+      </w:r>
+      <w:r>
+        <w:t xml:space="preserve"> (VLSM) to divide it for 10 departments.</w:t>
+      </w:r>
+    </w:p>
+    <w:p>
+      <w:pPr>
+        <w:spacing w:after="0"/>
+      </w:pPr>
+    </w:p>
+    <w:p>
+      <w:pPr>
+        <w:spacing w:after="0"/>
+      </w:pPr>
+      <w:r>
+        <w:t>Number of subnets: 2</w:t>
+      </w:r>
+      <w:r>
+        <w:rPr>
+          <w:vertAlign w:val="superscript"/>
+        </w:rPr>
+        <w:t>n</w:t>
+      </w:r>
+      <w:r>
+        <w:t xml:space="preserve"> = 2</w:t>
+      </w:r>
+    </w:p>
+    <w:p>
+      <w:pPr>
+        <w:spacing w:after="0"/>
+      </w:pPr>
+      <w:r>
+        <w:tab/>
+      </w:r>
+      <w:r>
+        <w:tab/>
+        <w:t xml:space="preserve">      : 2</w:t>
+      </w:r>
+      <w:r>
+        <w:rPr>
+          <w:color w:val="EE0000"/>
+          <w:vertAlign w:val="superscript"/>
+        </w:rPr>
+        <w:t>1</w:t>
+      </w:r>
+      <w:r>
+        <w:t xml:space="preserve"> = 2</w:t>
+      </w:r>
+    </w:p>
+    <w:p>
+      <w:pPr>
+        <w:spacing w:after="0"/>
+      </w:pPr>
+      <w:r>
+        <w:t>New Subnet mask: 172.16.0.0/17 = 255.255.128.0</w:t>
+      </w:r>
+    </w:p>
+    <w:p>
+      <w:pPr>
+        <w:spacing w:after="0"/>
+      </w:pPr>
+      <w:r>
+        <w:t xml:space="preserve">In Binary: </w:t>
+      </w:r>
+      <w:r>
+        <w:t>11111111.</w:t>
+      </w:r>
+      <w:r>
+        <w:t xml:space="preserve"> </w:t>
+      </w:r>
+      <w:r>
+        <w:t>11111111.</w:t>
+      </w:r>
+      <w:r>
+        <w:t>1</w:t>
+      </w:r>
+      <w:r>
+        <w:t>0000000.</w:t>
+      </w:r>
+      <w:r>
+        <w:t xml:space="preserve"> </w:t>
+      </w:r>
+      <w:r>
+        <w:t>00000000</w:t>
+      </w:r>
+    </w:p>
+    <w:p>
+      <w:pPr>
+        <w:spacing w:after="0"/>
+      </w:pPr>
+      <w:r>
+        <w:t>This gives us 2 subnets with a total of: 2</w:t>
+      </w:r>
+      <w:r>
+        <w:rPr>
+          <w:vertAlign w:val="superscript"/>
+        </w:rPr>
+        <w:t>15</w:t>
+      </w:r>
+      <w:r>
+        <w:t xml:space="preserve"> = 32768 IP addresses (Including Network and Broadcast Address) on each subnet</w:t>
+      </w:r>
+    </w:p>
+    <w:p>
+      <w:pPr>
+        <w:spacing w:after="0"/>
+      </w:pPr>
+    </w:p>
+    <w:p>
+      <w:pPr>
+        <w:spacing w:after="0"/>
+        <w:rPr>
+          <w:sz w:val="24"/>
+          <w:szCs w:val="24"/>
+        </w:rPr>
+      </w:pPr>
     </w:p>
     <w:sectPr>
       <w:pgSz w:w="11906" w:h="16838"/>
@@ -64,7 +218,7 @@
 </file>
 
 <file path=word/numbering.xml><?xml version="1.0" encoding="utf-8"?>
-<w:numbering xmlns:wpc="http://schemas.microsoft.com/office/word/2010/wordprocessingCanvas" xmlns:cx="http://schemas.microsoft.com/office/drawing/2014/chartex" xmlns:cx1="http://schemas.microsoft.com/office/drawing/2015/9/8/chartex" xmlns:cx2="http://schemas.microsoft.com/office/drawing/2015/10/21/chartex" xmlns:cx3="http://schemas.microsoft.com/office/drawing/2016/5/9/chartex" xmlns:cx4="http://schemas.microsoft.com/office/drawing/2016/5/10/chartex" xmlns:cx5="http://schemas.microsoft.com/office/drawing/2016/5/11/chartex" xmlns:cx6="http://schemas.microsoft.com/office/drawing/2016/5/12/chartex" xmlns:cx7="http://schemas.microsoft.com/office/drawing/2016/5/13/chartex" xmlns:cx8="http://schemas.microsoft.com/office/drawing/2016/5/14/chartex" xmlns:mc="http://schemas.openxmlformats.org/markup-compatibility/2006" xmlns:aink="http://schemas.microsoft.com/office/drawing/2016/ink" xmlns:am3d="http://schemas.microsoft.com/office/drawing/2017/model3d" xmlns:o="urn:schemas-microsoft-com:office:office" xmlns:oel="http://schemas.microsoft.com/office/2019/extlst" xmlns:r="http://schemas.openxmlformats.org/officeDocument/2006/relationships" xmlns:m="http://schemas.openxmlformats.org/officeDocument/2006/math" xmlns:v="urn:schemas-microsoft-com:vml" xmlns:wp14="http://schemas.microsoft.com/office/word/2010/wordprocessingDrawing" xmlns:wp="http://schemas.openxmlformats.org/drawingml/2006/wordprocessingDrawing" xmlns:w10="urn:schemas-microsoft-com:office:word" xmlns:w="http://schemas.openxmlformats.org/wordprocessingml/2006/main" xmlns:w14="http://schemas.microsoft.com/office/word/2010/wordml" xmlns:w15="http://schemas.microsoft.com/office/word/2012/wordml" xmlns:w16cex="http://schemas.microsoft.com/office/word/2018/wordml/cex" xmlns:w16cid="http://schemas.microsoft.com/office/word/2016/wordml/cid" xmlns:w16="http://schemas.microsoft.com/office/word/2018/wordml" xmlns:w16du="http://schemas.microsoft.com/office/word/2023/wordml/word16du" xmlns:w16sdtdh="http://schemas.microsoft.com/office/word/2020/wordml/sdtdatahash" xmlns:w16sdtfl="http://schemas.microsoft.com/office/word/2024/wordml/sdtformatlock" xmlns:w16se="http://schemas.microsoft.com/office/word/2015/wordml/symex" xmlns:wpg="http://schemas.microsoft.com/office/word/2010/wordprocessingGroup" xmlns:wpi="http://schemas.microsoft.com/office/word/2010/wordprocessingInk" xmlns:wne="http://schemas.microsoft.com/office/word/2006/wordml" xmlns:wps="http://schemas.microsoft.com/office/word/2010/wordprocessingShape" mc:Ignorable="w14 w15 w16se w16cid w16 w16cex w16sdtdh w16sdtfl w16du wp14">
+<w:numbering xmlns:wpc="http://schemas.microsoft.com/office/word/2010/wordprocessingCanvas" xmlns:cx="http://schemas.microsoft.com/office/drawing/2014/chartex" xmlns:cx1="http://schemas.microsoft.com/office/drawing/2015/9/8/chartex" xmlns:cx2="http://schemas.microsoft.com/office/drawing/2015/10/21/chartex" xmlns:cx3="http://schemas.microsoft.com/office/drawing/2016/5/9/chartex" xmlns:cx4="http://schemas.microsoft.com/office/drawing/2016/5/10/chartex" xmlns:cx5="http://schemas.microsoft.com/office/drawing/2016/5/11/chartex" xmlns:cx6="http://schemas.microsoft.com/office/drawing/2016/5/12/chartex" xmlns:cx7="http://schemas.microsoft.com/office/drawing/2016/5/13/chartex" xmlns:cx8="http://schemas.microsoft.com/office/drawing/2016/5/14/chartex" xmlns:mc="http://schemas.openxmlformats.org/markup-compatibility/2006" xmlns:aink="http://schemas.microsoft.com/office/drawing/2016/ink" xmlns:am3d="http://schemas.microsoft.com/office/drawing/2017/model3d" xmlns:o="urn:schemas-microsoft-com:office:office" xmlns:oel="http://schemas.microsoft.com/office/2019/extlst" xmlns:r="http://schemas.openxmlformats.org/officeDocument/2006/relationships" xmlns:m="http://schemas.openxmlformats.org/officeDocument/2006/math" xmlns:v="urn:schemas-microsoft-com:vml" xmlns:wp14="http://schemas.microsoft.com/office/word/2010/wordprocessingDrawing" xmlns:wp="http://schemas.openxmlformats.org/drawingml/2006/wordprocessingDrawing" xmlns:w10="urn:schemas-microsoft-com:office:word" xmlns:w="http://schemas.openxmlformats.org/wordprocessingml/2006/main" xmlns:w14="http://schemas.microsoft.com/office/word/2010/wordml" xmlns:w15="http://schemas.microsoft.com/office/word/2012/wordml" xmlns:w16cei="http://schemas.microsoft.com/office/word/2026/wordml/cei" xmlns:w16cex="http://schemas.microsoft.com/office/word/2018/wordml/cex" xmlns:w16cid="http://schemas.microsoft.com/office/word/2016/wordml/cid" xmlns:w16="http://schemas.microsoft.com/office/word/2018/wordml" xmlns:w16du="http://schemas.microsoft.com/office/word/2023/wordml/word16du" xmlns:w16sdtdh="http://schemas.microsoft.com/office/word/2020/wordml/sdtdatahash" xmlns:w16sdtfl="http://schemas.microsoft.com/office/word/2024/wordml/sdtformatlock" xmlns:w16se="http://schemas.microsoft.com/office/word/2015/wordml/symex" xmlns:wpg="http://schemas.microsoft.com/office/word/2010/wordprocessingGroup" xmlns:wpi="http://schemas.microsoft.com/office/word/2010/wordprocessingInk" xmlns:wne="http://schemas.microsoft.com/office/word/2006/wordml" xmlns:wps="http://schemas.microsoft.com/office/word/2010/wordprocessingShape" mc:Ignorable="w14 w15 w16se w16cid w16 w16cex w16sdtdh w16sdtfl w16du wp14">
   <w:abstractNum w:abstractNumId="0" w15:restartNumberingAfterBreak="0">
     <w:nsid w:val="1BD437D4"/>
     <w:multiLevelType w:val="hybridMultilevel"/>
@@ -787,7 +941,6 @@
   <w:style w:type="character" w:default="1" w:styleId="DefaultParagraphFont">
     <w:name w:val="Default Paragraph Font"/>
     <w:uiPriority w:val="1"/>
-    <w:semiHidden/>
     <w:unhideWhenUsed/>
   </w:style>
   <w:style w:type="table" w:default="1" w:styleId="TableNormal">

</xml_diff>